<commit_message>
auto(daily): dev loop report 2026-06-12
</commit_message>
<xml_diff>
--- a/reports/hypothesis/2026-06-12.docx
+++ b/reports/hypothesis/2026-06-12.docx
@@ -15,7 +15,7 @@
         <w:rPr>
           <w:i/>
         </w:rPr>
-        <w:t>생성일: 2026-06-12 09:15 KST  |  표본: 측정소당 최소 2436건 / 총 12355건</w:t>
+        <w:t>생성일: 2026-06-12 14:00 KST  |  표본: 측정소당 최소 2441건 / 총 12380건</w:t>
       </w:r>
     </w:p>
     <w:p>
@@ -143,7 +143,7 @@
           </w:tcPr>
           <w:p>
             <w:r>
-              <w:t>36.896</w:t>
+              <w:t>36.877</w:t>
             </w:r>
           </w:p>
         </w:tc>
@@ -153,7 +153,7 @@
           </w:tcPr>
           <w:p>
             <w:r>
-              <w:t>33.812</w:t>
+              <w:t>33.795</w:t>
             </w:r>
           </w:p>
         </w:tc>
@@ -163,7 +163,7 @@
           </w:tcPr>
           <w:p>
             <w:r>
-              <w:t>+3.085</w:t>
+              <w:t>+3.082</w:t>
             </w:r>
           </w:p>
         </w:tc>
@@ -215,7 +215,7 @@
           </w:tcPr>
           <w:p>
             <w:r>
-              <w:t>20.576</w:t>
+              <w:t>20.566</w:t>
             </w:r>
           </w:p>
         </w:tc>
@@ -225,7 +225,7 @@
           </w:tcPr>
           <w:p>
             <w:r>
-              <w:t>17.574</w:t>
+              <w:t>17.586</w:t>
             </w:r>
           </w:p>
         </w:tc>
@@ -235,7 +235,7 @@
           </w:tcPr>
           <w:p>
             <w:r>
-              <w:t>+3.002</w:t>
+              <w:t>+2.980</w:t>
             </w:r>
           </w:p>
         </w:tc>
@@ -660,7 +660,7 @@
           </w:tcPr>
           <w:p>
             <w:r>
-              <w:t>32.08</w:t>
+              <w:t>32.15</w:t>
             </w:r>
           </w:p>
         </w:tc>
@@ -722,7 +722,7 @@
           </w:tcPr>
           <w:p>
             <w:r>
-              <w:t>78.46</w:t>
+              <w:t>78.30</w:t>
             </w:r>
           </w:p>
         </w:tc>
@@ -784,7 +784,7 @@
           </w:tcPr>
           <w:p>
             <w:r>
-              <w:t>11.49</w:t>
+              <w:t>11.53</w:t>
             </w:r>
           </w:p>
         </w:tc>
@@ -846,7 +846,7 @@
           </w:tcPr>
           <w:p>
             <w:r>
-              <w:t>157.70</w:t>
+              <w:t>158.51</w:t>
             </w:r>
           </w:p>
         </w:tc>
@@ -908,7 +908,7 @@
           </w:tcPr>
           <w:p>
             <w:r>
-              <w:t>66.62</w:t>
+              <w:t>66.30</w:t>
             </w:r>
           </w:p>
         </w:tc>
@@ -970,7 +970,7 @@
           </w:tcPr>
           <w:p>
             <w:r>
-              <w:t>144.06</w:t>
+              <w:t>143.92</w:t>
             </w:r>
           </w:p>
         </w:tc>
@@ -1029,7 +1029,7 @@
         <w:pStyle w:val="ListBullet"/>
       </w:pPr>
       <w:r>
-        <w:t>'산단 영향군'가 '베이스라인'보다 평균 3.00 높음 (p=0.0000, 효과크기 작음 d=0.23).</w:t>
+        <w:t>'산단 영향군'가 '베이스라인'보다 평균 2.98 높음 (p=0.0000, 효과크기 작음 d=0.23).</w:t>
       </w:r>
     </w:p>
     <w:p>

</xml_diff>